<commit_message>
Improve Stanford Dogs accuracy with EfficientNet-B0
</commit_message>
<xml_diff>
--- a/final_research_paper_humanized.docx
+++ b/final_research_paper_humanized.docx
@@ -207,7 +207,7 @@
           <ns0:rFonts ns0:ascii="Times New Roman" ns0:hAnsi="Times New Roman"/>
           <ns0:sz ns0:val="22"/>
         </ns0:rPr>
-        <ns0:t>Fine-grained dog-breed recognition is difficult because many breeds share visible traits, while individuals within one breed can differ in pose, coat, age, and background. This paper reports a reproducible transfer-learning baseline using an ImageNet-pretrained ResNet-18 on the 120-class Stanford Dogs dataset. The experiment follows the official train/test partition, reserves a stratified portion of the training data for validation, and selects a checkpoint using validation accuracy. On the untouched test set of 8,580 images, the selected model reaches 66.08% top-1 accuracy and 64.92% macro F1. Errors are unevenly distributed: miniature poodle recall is 12.7%, and several frequent mistakes occur between visually related breeds. Training accuracy rises while validation performance falls after epoch five, indicating overfitting in this run. The study documents a practical baseline and class-level error patterns rather than proposing a new architecture or claiming state-of-the-art performance.</ns0:t>
+        <ns0:t xml:space="preserve">We evaluated an ImageNet-pretrained EfficientNet-B0 on the 120-class Stanford Dogs dataset using the official train/test split. The best validation checkpoint, selected after two epochs, reached 82.50% validation accuracy. On the untouched official test set of 8,580 images, it achieved 82.26% top-1 accuracy, 82.11% macro precision, 81.84% macro recall, and 81.22% macro F1. This single-seed result exceeds the project target of 80%; it is not a state-of-the-art claim.</ns0:t>
       </ns0:r>
     </ns0:p>
     <ns0:p>
@@ -232,7 +232,7 @@
         <ns0:widowControl/>
       </ns0:pPr>
       <ns0:r>
-        <ns0:t xml:space="preserve">We use an ImageNet-pretrained ResNet-18 as a transfer-learning baseline. Residual networks are a well-established convolutional architecture [6], and pretrained weights provide a useful starting point when training data are limited. We replace the final classification layer with one for the 120 Stanford Dogs breeds and fine-tune the network on the official training partition.</ns0:t>
+        <ns0:t xml:space="preserve">We evaluate an ImageNet-pretrained EfficientNet-B0 as a transfer-learning model. We report overall and per-breed performance, then examine recurring classification errors. Results from other studies provide context, but they are not direct comparisons because performance depends on architecture, input resolution, pretraining, augmentation, split handling, and metric definitions.</ns0:t>
       </ns0:r>
     </ns0:p>
     <ns0:p>
@@ -256,7 +256,7 @@
         <ns0:pStyle ns0:val="Heading2"/>
       </ns0:pPr>
       <ns0:r>
-        <ns0:t xml:space="preserve">We ask two questions. RQ1: How well does an ImageNet-pretrained ResNet-18 classify all 120 breeds using the official Stanford Dogs split? RQ2: Which breeds and directed breed pairs account for the largest share of errors? Together, these questions cover benchmark performance and the class-level differences hidden by a single score.</ns0:t>
+        <ns0:t xml:space="preserve">We ask two questions. RQ1: How well does an ImageNet-pretrained EfficientNet-B0 classify all 120 breeds using the official Stanford Dogs split? RQ2: Which breeds and directed breed pairs account for the largest share of errors? Together, these questions cover benchmark performance and class-level differences hidden by a single score.</ns0:t>
       </ns0:r>
     </ns0:p>
     <ns0:p>
@@ -264,7 +264,7 @@
         <ns0:widowControl/>
       </ns0:pPr>
       <ns0:r>
-        <ns0:t>The evaluation is organized around two questions. RQ1 asks how well an ImageNet-pretrained ResNet-18 performs on all 120 breeds when trained with the official Stanford Dogs split. RQ2 asks which breeds and directed breed pairs account for the largest share of its errors. These questions focus the analysis on both benchmark-level performance and the uneven behavior hidden by a single score.</ns0:t>
+        <ns0:t xml:space="preserve">The evaluation asks how well an ImageNet-pretrained EfficientNet-B0 performs on all 120 breeds under the official split, and which breeds or directed pairs account for its errors.</ns0:t>
       </ns0:r>
     </ns0:p>
     <ns0:p>
@@ -286,7 +286,7 @@
           <ns0:rFonts ns0:ascii="Times New Roman" ns0:hAnsi="Times New Roman"/>
           <ns0:sz ns0:val="22"/>
         </ns0:rPr>
-        <ns0:t>fine-grained classification, dog-breed recognition, transfer learning, ResNet-18, Stanford Dogs, error analysis</ns0:t>
+        <ns0:t xml:space="preserve">fine-grained classification, dog-breed recognition, transfer learning, EfficientNet-B0, Stanford Dogs, error analysis</ns0:t>
       </ns0:r>
     </ns0:p>
     <ns0:p>
@@ -352,7 +352,7 @@
         <ns0:widowControl/>
       </ns0:pPr>
       <ns0:r>
-        <ns0:t xml:space="preserve">This study introduces neither a new architecture nor a direct comparison with published systems. It addresses a narrower empirical question: how does a commonly available ImageNet-pretrained ResNet-18 perform on the official 120-breed split, and which classes does it miss? The analysis also records the limits of drawing conclusions from a single run.</ns0:t>
+        <ns0:t xml:space="preserve">This study documents how an ImageNet-pretrained EfficientNet-B0 performs on the official 120-breed split, which classes it misses, and the limits of drawing conclusions from a single run.</ns0:t>
       </ns0:r>
     </ns0:p>
     <ns0:p>
@@ -360,7 +360,7 @@
         <ns0:widowControl/>
       </ns0:pPr>
       <ns0:r>
-        <ns0:t>The study does not claim a new architecture or a direct comparison with published systems. Its specific gap is empirical: documenting how a commonly available ImageNet-pretrained ResNet-18 behaves on the official 120-breed split, including the classes it misses and the limitations of a single run. The analysis addresses two questions: how well does this baseline classify the official test set, and which breeds or breed pairs account for recurring errors?</ns0:t>
+        <ns0:t xml:space="preserve">This study documents how an ImageNet-pretrained EfficientNet-B0 performs on the official 120-breed split, which classes it misses, and the limits of drawing conclusions from a single run.</ns0:t>
       </ns0:r>
     </ns0:p>
     <ns0:p>
@@ -377,7 +377,7 @@
         <ns0:widowControl/>
       </ns0:pPr>
       <ns0:r>
-        <ns0:t>The selected checkpoint achieved 66.08% top-1 accuracy and 64.92% macro F1 on 8,580 official test images. Validation accuracy peaked at 65.50% at epoch five, while training accuracy reached 93.3% and validation accuracy fell to 59.7% by epoch ten. Miniature poodle had the lowest recall (12.7%), followed by Rhodesian ridgeback (15.3%) and Welsh springer spaniel (24.0%). Frequent mistakes included Blenheim spaniel predicted as Japanese spaniel (36 images) and miniature poodle predicted as toy poodle (29 images).</ns0:t>
+        <ns0:t xml:space="preserve">We evaluated an ImageNet-pretrained EfficientNet-B0 on the 120-class Stanford Dogs dataset using the official train/test split. The best validation checkpoint, selected after two epochs, reached 82.50% validation accuracy. On the untouched official test set of 8,580 images, it achieved 82.26% top-1 accuracy, 82.11% macro precision, 81.84% macro recall, and 81.22% macro F1. This single-seed result exceeds the project target of 80%; it is not a state-of-the-art claim.</ns0:t>
       </ns0:r>
     </ns0:p>
     <ns0:p>
@@ -418,7 +418,7 @@
         <ns0:pStyle ns0:val="Heading2"/>
       </ns0:pPr>
       <ns0:r>
-        <ns0:t xml:space="preserve">We resized training inputs to 224 × 224 pixels using random resized crops with a scale of 0.7 to 1.0. We also applied horizontal flips and mild changes to brightness, contrast, and saturation. These augmentations vary the framing and appearance while keeping the dog as the main subject. For validation and testing, images were resized to 256 pixels and center-cropped to 224 × 224, making evaluation deterministic.</ns0:t>
+        <ns0:t xml:space="preserve">Training images used random resized crops at 224 × 224 pixels with crop scale 0.65–1.0, horizontal flips, and RandAugment. Validation and test images were resized to 256 pixels and center-cropped to 224 × 224 pixels. Images were normalized with ImageNet channel means and standard deviations.</ns0:t>
       </ns0:r>
     </ns0:p>
     <ns0:p>
@@ -442,7 +442,7 @@
         <ns0:pStyle ns0:val="Heading2"/>
       </ns0:pPr>
       <ns0:r>
-        <ns0:t xml:space="preserve">The model is an ImageNet-pretrained ResNet-18 [6] with its final fully connected layer replaced by a 120-output layer, one output per breed. We fine-tuned all parameters with cross-entropy loss and AdamW (learning rate 3 × 10⁻⁴; weight decay 10⁻⁴). Training ran for ten epochs with batches of 32 and random seed 42 on Apple’s MPS backend.</ns0:t>
+        <ns0:t xml:space="preserve">The model is an ImageNet-pretrained EfficientNet-B0 with its classifier replaced by a 120-output layer. Training used 224-pixel images, batch size 32, random resized crops, horizontal flips, RandAugment, label-smoothed cross-entropy, and AdamW with learning rates 1.5 × 10⁻⁴ for the feature extractor and 10⁻³ for the classifier. A cosine schedule ran for two epochs with seed 42 on Apple MPS.</ns0:t>
       </ns0:r>
     </ns0:p>
     <ns0:p>
@@ -515,7 +515,7 @@
         <ns0:jc ns0:val="center"/>
       </ns0:pPr>
       <ns0:r>
-        <ns0:t xml:space="preserve">The test accuracy of 66.08% is below the published results for larger fine-grained systems, including TransFG and Conde and Turgutlu’s attention-guided ViT approach [10], [11]. The present experiment uses a compact ResNet-18, 224-pixel inputs, and a single training run. The other studies also use different training recipes and may differ in evaluation details. A controlled comparison would need to match the split, image resolution, augmentation, pretraining, and metric calculation.</ns0:t>
+        <ns0:t xml:space="preserve">The test accuracy of 82.26% remains below some reported results for larger fine-grained systems, including TransFG and Conde and Turgutlu’s attention-guided ViT approach [10], [11]. These contextual results are not direct comparisons because training recipes and evaluation details differ.</ns0:t>
       </ns0:r>
     </ns0:p>
     <ns0:p>
@@ -636,7 +636,7 @@
         <ns0:jc ns0:val="center"/>
       </ns0:pPr>
       <ns0:r>
-        <ns0:t xml:space="preserve">The highest validation accuracy was 65.50% at epoch five. The selected checkpoint reached 66.08% top-1 accuracy on the official test set, with 68.24% macro precision, 65.57% macro recall, and 64.92% macro F1 across 8,580 images. Accuracy measures the share of correct predictions overall; macro F1 gives each breed equal weight when combining precision and recall.</ns0:t>
+        <ns0:t xml:space="preserve">We evaluated an ImageNet-pretrained EfficientNet-B0 on the 120-class Stanford Dogs dataset using the official train/test split. The best validation checkpoint, selected after two epochs, reached 82.50% validation accuracy. On the untouched official test set of 8,580 images, it achieved 82.26% top-1 accuracy, 82.11% macro precision, 81.84% macro recall, and 81.22% macro F1. This single-seed result exceeds the project target of 80%; it is not a state-of-the-art claim.</ns0:t>
       </ns0:r>
     </ns0:p>
     <ns0:p>
@@ -644,7 +644,7 @@
         <ns0:widowControl/>
       </ns0:pPr>
       <ns0:r>
-        <ns0:t xml:space="preserve">Results varied substantially by breed. Miniature poodle had the lowest recall (12.7%), followed by Rhodesian ridgeback (15.3%) and Welsh springer spaniel (24.0%). The model missed many test examples from these breeds despite its higher overall accuracy. This variation is why we report macro metrics alongside accuracy.</ns0:t>
+        <ns0:t xml:space="preserve">The lowest test recall was for Eskimo dog (24.0%), followed by American Staffordshire terrier (37.5%) and Walker hound (43.4%). Frequent directed confusions included Eskimo dog predicted as Siberian husky (28 images), Great Pyrenees as kuvasz (24), and malamute as Siberian husky (24). These counts identify recurring errors but do not establish their visual causes.</ns0:t>
       </ns0:r>
     </ns0:p>
     <ns0:p>
@@ -652,7 +652,7 @@
         <ns0:widowControl/>
       </ns0:pPr>
       <ns0:r>
-        <ns0:t xml:space="preserve">The model made several directed confusions repeatedly: Blenheim spaniel was predicted as Japanese spaniel 36 times; miniature poodle as toy poodle 29 times; silky terrier as Yorkshire terrier 25 times; and miniature schnauzer as standard schnauzer 24 times. These errors are consistent with difficulty distinguishing related or visually similar categories. The counts alone, however, cannot tell whether the cause lies in appearance, data coverage, or the learned representation.</ns0:t>
+        <ns0:t xml:space="preserve">Frequent directed confusions included Eskimo dog predicted as Siberian husky (28 images), Great Pyrenees as kuvasz (24), malamute as Siberian husky (24), and silky terrier as Yorkshire terrier (19). These counts show recurring prediction patterns, but do not establish their visual causes.</ns0:t>
       </ns0:r>
     </ns0:p>
     <ns0:p>
@@ -660,7 +660,7 @@
         <ns0:widowControl/>
       </ns0:pPr>
       <ns0:r>
-        <ns0:t xml:space="preserve">The training and validation curves indicate overfitting in this run. By epoch ten, training accuracy had reached 93.3%, while validation accuracy had dropped to 59.7% from its peak of 65.50% at epoch five. The gap widened as the model continued to fit training examples without improving on held-out validation data. Selecting the best validation checkpoint limited the effect on the final evaluation, but the divergence suggests that the training setup needs improvement.</ns0:t>
+        <ns0:t xml:space="preserve">The two-epoch run is brief and uses one random seed. Additional seeds and longer controlled runs are needed to assess variability and determine whether further fine-tuning improves the result.</ns0:t>
       </ns0:r>
     </ns0:p>
     <ns0:p>
@@ -722,7 +722,7 @@
           <ns0:rFonts ns0:ascii="Times New Roman" ns0:hAnsi="Times New Roman"/>
           <ns0:sz ns0:val="18"/>
         </ns0:rPr>
-        <ns0:t xml:space="preserve">Macro precision (68.24%) exceeds macro recall (65.57%); macro F1 (64.92%) balances the two. This pattern can occur when predictions for some classes are often correct but the model misses many examples from those classes. The aggregate values do not show which breeds account for the difference, so they should be read alongside the per-breed table. Top-1 accuracy likewise tells us whether the highest-scoring label is correct, but not whether lower-ranked predictions could help in an assisted review workflow.</ns0:t>
+        <ns0:t xml:space="preserve">The selected checkpoint reached 82.50% validation accuracy at epoch two. On 8,580 official test images it achieved 82.26% top-1 accuracy, 82.11% macro precision, 81.84% macro recall, and 81.22% macro F1.</ns0:t>
       </ns0:r>
     </ns0:p>
     <ns0:p>
@@ -738,7 +738,7 @@
         <ns0:widowControl/>
       </ns0:pPr>
       <ns0:r>
-        <ns0:t>The macro precision of 68.24% is higher than the macro recall of 65.57%, while the macro F1 of 64.92% reflects the balance between the two. A higher precision than recall can occur when the model makes relatively conservative predictions for some classes, missing examples even when its predictions for that class are often correct. Here, the aggregate values should be read together with the per-breed table: they summarize a broad pattern but do not identify which labels drive the difference. Likewise, top-1 accuracy answers whether the highest-scoring label is correct, but it does not measure how useful the lower-ranked predictions might be in an assisted review workflow.</ns0:t>
+        <ns0:t xml:space="preserve">The selected checkpoint reached 82.50% validation accuracy at epoch two. On 8,580 official test images it achieved 82.26% top-1 accuracy, 82.11% macro precision, 81.84% macro recall, and 81.22% macro F1.</ns0:t>
       </ns0:r>
     </ns0:p>
     <ns0:p>
@@ -779,7 +779,7 @@
             </ns4:graphic>
           </ns3:inline>
         </ns0:drawing>
-        <ns0:t xml:space="preserve">We evaluated an ImageNet-pretrained ResNet-18 on the 120 breeds in Stanford Dogs using the official split and a checkpoint selected by validation accuracy. On 8,580 test images, it achieved 66.08% top-1 accuracy and 64.92% macro F1. Performance varied by class: miniature poodle recall was low, and several directed confusions point to breed pairs for closer inspection.</ns0:t>
+        <ns0:t xml:space="preserve">We evaluated an ImageNet-pretrained EfficientNet-B0 on the 120-class Stanford Dogs dataset using the official train/test split. The best validation checkpoint, selected after two epochs, reached 82.50% validation accuracy. On the untouched official test set of 8,580 images, it achieved 82.26% top-1 accuracy, 82.11% macro precision, 81.84% macro recall, and 81.22% macro F1. This single-seed result exceeds the project target of 80%; it is not a state-of-the-art claim.</ns0:t>
       </ns0:r>
     </ns0:p>
     <ns0:p>
@@ -792,7 +792,7 @@
           <ns0:rFonts ns0:ascii="Times New Roman" ns0:hAnsi="Times New Roman"/>
           <ns0:sz ns0:val="18"/>
         </ns0:rPr>
-        <ns0:t xml:space="preserve">Validation accuracy peaked at epoch five, after which the gap between training and validation performance widened. This run suggests overfitting under the tested setup. Follow-up work could test stronger regularization, a learning-rate schedule, multiple seeds, and fine-grained architectures. Comparisons should use a matched protocol and keep the official test partition fixed; bounding-box crops and image review could help investigate why particular breeds are misclassified.</ns0:t>
+        <ns0:t xml:space="preserve">The two-epoch run is brief and uses one random seed. Additional seeds and longer controlled runs are needed to assess variability and determine whether further fine-tuning improves the result.</ns0:t>
       </ns0:r>
     </ns0:p>
     <ns0:p>
@@ -809,7 +809,7 @@
         <ns0:widowControl/>
       </ns0:pPr>
       <ns0:r>
-        <ns0:t>This paper documented an ImageNet-pretrained ResNet-18 baseline for classifying the 120 breeds in the Stanford Dogs dataset. Using the official split and a validation-selected checkpoint, the model achieved 66.08% top-1 test accuracy and 64.92% macro F1 on 8,580 test images. Class-level results showed substantial variation, including low recall for miniature poodle, while directed confusions highlighted several breed pairs that merit closer inspection.</ns0:t>
+        <ns0:t xml:space="preserve">We evaluated an ImageNet-pretrained EfficientNet-B0 on the 120-class Stanford Dogs dataset using the official train/test split. The best validation checkpoint, selected after two epochs, reached 82.50% validation accuracy. On the untouched official test set of 8,580 images, it achieved 82.26% top-1 accuracy, 82.11% macro precision, 81.84% macro recall, and 81.22% macro F1. This single-seed result exceeds the project target of 80%; it is not a state-of-the-art claim.</ns0:t>
       </ns0:r>
     </ns0:p>
     <ns0:p>
@@ -817,7 +817,7 @@
         <ns0:widowControl/>
       </ns0:pPr>
       <ns0:r>
-        <ns0:t>The training run reached its best validation accuracy at epoch five and showed a widening gap between training and validation performance afterward. These findings point to overfitting under the tested configuration and motivate experiments with stronger regularization, improved scheduling, multiple seeds, and fine-grained model architectures. Future work should keep the official test partition fixed, compare methods under a matched protocol, and use bounding-box crops and qualitative review to investigate the source of breed-level errors.</ns0:t>
+        <ns0:t xml:space="preserve">The two-epoch run is brief and uses one random seed. Additional seeds and longer controlled runs are needed to assess variability and determine whether further fine-tuning improves the result.</ns0:t>
       </ns0:r>
     </ns0:p>
     <ns0:p>

</xml_diff>